<commit_message>
continuing to validate documentation and development guide prior to beginning project
</commit_message>
<xml_diff>
--- a/docs/01_Project_Plan_Retail_Sector_Health.docx
+++ b/docs/01_Project_Plan_Retail_Sector_Health.docx
@@ -10558,7 +10558,7 @@
                 <w:sz w:val="19"/>
                 <w:szCs w:val="19"/>
               </w:rPr>
-              <w:t xml:space="preserve">20</w:t>
+              <w:t xml:space="preserve">15</w:t>
             </w:r>
           </w:p>
         </w:tc>
@@ -10584,7 +10584,7 @@
                 <w:sz w:val="19"/>
                 <w:szCs w:val="19"/>
               </w:rPr>
-              <w:t xml:space="preserve">Data Dictionary (XLSX)</w:t>
+              <w:t xml:space="preserve">Report Build Instructions</w:t>
             </w:r>
           </w:p>
         </w:tc>
@@ -10636,7 +10636,7 @@
                 <w:sz w:val="19"/>
                 <w:szCs w:val="19"/>
               </w:rPr>
-              <w:t xml:space="preserve">Six tabs: source columns, model tables, column dictionary, all 79 measures with full DAX, relationships. The single source of truth for measure definitions</w:t>
+              <w:t xml:space="preserve">The complete visual specification for all ten pages and eighty-seven visuals, the report themes, and the click-by-click build patterns</w:t>
             </w:r>
           </w:p>
         </w:tc>
@@ -10667,6 +10667,224 @@
                 <w:sz w:val="19"/>
                 <w:szCs w:val="19"/>
               </w:rPr>
+              <w:t xml:space="preserve">20</w:t>
+            </w:r>
+          </w:p>
+        </w:tc>
+        <w:tc>
+          <w:tcPr>
+            <w:tcW w:type="dxa" w:w="3744"/>
+            <w:tcMar>
+              <w:top w:type="dxa" w:w="60"/>
+              <w:left w:type="dxa" w:w="100"/>
+              <w:bottom w:type="dxa" w:w="60"/>
+              <w:right w:type="dxa" w:w="100"/>
+            </w:tcMar>
+          </w:tcPr>
+          <w:p>
+            <w:pPr>
+              <w:spacing w:after="0" w:line="240"/>
+            </w:pPr>
+            <w:r>
+              <w:rPr>
+                <w:rFonts w:ascii="Times New Roman" w:cs="Times New Roman" w:eastAsia="Times New Roman" w:hAnsi="Times New Roman"/>
+                <w:b w:val="false"/>
+                <w:bCs w:val="false"/>
+                <w:sz w:val="19"/>
+                <w:szCs w:val="19"/>
+              </w:rPr>
+              <w:t xml:space="preserve">Data Dictionary (XLSX)</w:t>
+            </w:r>
+          </w:p>
+        </w:tc>
+        <w:tc>
+          <w:tcPr>
+            <w:tcW w:type="dxa" w:w="1872"/>
+            <w:tcMar>
+              <w:top w:type="dxa" w:w="60"/>
+              <w:left w:type="dxa" w:w="100"/>
+              <w:bottom w:type="dxa" w:w="60"/>
+              <w:right w:type="dxa" w:w="100"/>
+            </w:tcMar>
+          </w:tcPr>
+          <w:p>
+            <w:pPr>
+              <w:spacing w:after="0" w:line="240"/>
+            </w:pPr>
+            <w:r>
+              <w:rPr>
+                <w:rFonts w:ascii="Times New Roman" w:cs="Times New Roman" w:eastAsia="Times New Roman" w:hAnsi="Times New Roman"/>
+                <w:b w:val="false"/>
+                <w:bCs w:val="false"/>
+                <w:sz w:val="19"/>
+                <w:szCs w:val="19"/>
+              </w:rPr>
+              <w:t xml:space="preserve">Delivered</w:t>
+            </w:r>
+          </w:p>
+        </w:tc>
+        <w:tc>
+          <w:tcPr>
+            <w:tcW w:type="dxa" w:w="2621"/>
+            <w:tcMar>
+              <w:top w:type="dxa" w:w="60"/>
+              <w:left w:type="dxa" w:w="100"/>
+              <w:bottom w:type="dxa" w:w="60"/>
+              <w:right w:type="dxa" w:w="100"/>
+            </w:tcMar>
+          </w:tcPr>
+          <w:p>
+            <w:pPr>
+              <w:spacing w:after="0" w:line="240"/>
+            </w:pPr>
+            <w:r>
+              <w:rPr>
+                <w:rFonts w:ascii="Times New Roman" w:cs="Times New Roman" w:eastAsia="Times New Roman" w:hAnsi="Times New Roman"/>
+                <w:b w:val="false"/>
+                <w:bCs w:val="false"/>
+                <w:sz w:val="19"/>
+                <w:szCs w:val="19"/>
+              </w:rPr>
+              <w:t xml:space="preserve">Six tabs: source columns, model tables, column dictionary, all 79 measures with full DAX, relationships. The single source of truth for measure definitions</w:t>
+            </w:r>
+          </w:p>
+        </w:tc>
+      </w:tr>
+      <w:tr>
+        <w:trPr>
+          <w:cantSplit/>
+        </w:trPr>
+        <w:tc>
+          <w:tcPr>
+            <w:tcW w:type="dxa" w:w="1123"/>
+            <w:tcMar>
+              <w:top w:type="dxa" w:w="60"/>
+              <w:left w:type="dxa" w:w="100"/>
+              <w:bottom w:type="dxa" w:w="60"/>
+              <w:right w:type="dxa" w:w="100"/>
+            </w:tcMar>
+          </w:tcPr>
+          <w:p>
+            <w:pPr>
+              <w:spacing w:after="0" w:line="240"/>
+            </w:pPr>
+            <w:r>
+              <w:rPr>
+                <w:rFonts w:ascii="Times New Roman" w:cs="Times New Roman" w:eastAsia="Times New Roman" w:hAnsi="Times New Roman"/>
+                <w:b w:val="false"/>
+                <w:bCs w:val="false"/>
+                <w:sz w:val="19"/>
+                <w:szCs w:val="19"/>
+              </w:rPr>
+              <w:t xml:space="preserve">21</w:t>
+            </w:r>
+          </w:p>
+        </w:tc>
+        <w:tc>
+          <w:tcPr>
+            <w:tcW w:type="dxa" w:w="3744"/>
+            <w:tcMar>
+              <w:top w:type="dxa" w:w="60"/>
+              <w:left w:type="dxa" w:w="100"/>
+              <w:bottom w:type="dxa" w:w="60"/>
+              <w:right w:type="dxa" w:w="100"/>
+            </w:tcMar>
+          </w:tcPr>
+          <w:p>
+            <w:pPr>
+              <w:spacing w:after="0" w:line="240"/>
+            </w:pPr>
+            <w:r>
+              <w:rPr>
+                <w:rFonts w:ascii="Times New Roman" w:cs="Times New Roman" w:eastAsia="Times New Roman" w:hAnsi="Times New Roman"/>
+                <w:b w:val="false"/>
+                <w:bCs w:val="false"/>
+                <w:sz w:val="19"/>
+                <w:szCs w:val="19"/>
+              </w:rPr>
+              <w:t xml:space="preserve">Development Checklist (XLSX)</w:t>
+            </w:r>
+          </w:p>
+        </w:tc>
+        <w:tc>
+          <w:tcPr>
+            <w:tcW w:type="dxa" w:w="1872"/>
+            <w:tcMar>
+              <w:top w:type="dxa" w:w="60"/>
+              <w:left w:type="dxa" w:w="100"/>
+              <w:bottom w:type="dxa" w:w="60"/>
+              <w:right w:type="dxa" w:w="100"/>
+            </w:tcMar>
+          </w:tcPr>
+          <w:p>
+            <w:pPr>
+              <w:spacing w:after="0" w:line="240"/>
+            </w:pPr>
+            <w:r>
+              <w:rPr>
+                <w:rFonts w:ascii="Times New Roman" w:cs="Times New Roman" w:eastAsia="Times New Roman" w:hAnsi="Times New Roman"/>
+                <w:b w:val="false"/>
+                <w:bCs w:val="false"/>
+                <w:sz w:val="19"/>
+                <w:szCs w:val="19"/>
+              </w:rPr>
+              <w:t xml:space="preserve">Delivered</w:t>
+            </w:r>
+          </w:p>
+        </w:tc>
+        <w:tc>
+          <w:tcPr>
+            <w:tcW w:type="dxa" w:w="2621"/>
+            <w:tcMar>
+              <w:top w:type="dxa" w:w="60"/>
+              <w:left w:type="dxa" w:w="100"/>
+              <w:bottom w:type="dxa" w:w="60"/>
+              <w:right w:type="dxa" w:w="100"/>
+            </w:tcMar>
+          </w:tcPr>
+          <w:p>
+            <w:pPr>
+              <w:spacing w:after="0" w:line="240"/>
+            </w:pPr>
+            <w:r>
+              <w:rPr>
+                <w:rFonts w:ascii="Times New Roman" w:cs="Times New Roman" w:eastAsia="Times New Roman" w:hAnsi="Times New Roman"/>
+                <w:b w:val="false"/>
+                <w:bCs w:val="false"/>
+                <w:sz w:val="19"/>
+                <w:szCs w:val="19"/>
+              </w:rPr>
+              <w:t xml:space="preserve">Every build task across ten phases, each marked needed or not needed for this project with the reason, and a formula-driven progress block that follows edits to the list</w:t>
+            </w:r>
+          </w:p>
+        </w:tc>
+      </w:tr>
+      <w:tr>
+        <w:trPr>
+          <w:cantSplit/>
+        </w:trPr>
+        <w:tc>
+          <w:tcPr>
+            <w:tcW w:type="dxa" w:w="1123"/>
+            <w:tcMar>
+              <w:top w:type="dxa" w:w="60"/>
+              <w:left w:type="dxa" w:w="100"/>
+              <w:bottom w:type="dxa" w:w="60"/>
+              <w:right w:type="dxa" w:w="100"/>
+            </w:tcMar>
+          </w:tcPr>
+          <w:p>
+            <w:pPr>
+              <w:spacing w:after="0" w:line="240"/>
+            </w:pPr>
+            <w:r>
+              <w:rPr>
+                <w:rFonts w:ascii="Times New Roman" w:cs="Times New Roman" w:eastAsia="Times New Roman" w:hAnsi="Times New Roman"/>
+                <w:b w:val="false"/>
+                <w:bCs w:val="false"/>
+                <w:sz w:val="19"/>
+                <w:szCs w:val="19"/>
+              </w:rPr>
               <w:t xml:space="preserve">22</w:t>
             </w:r>
           </w:p>
@@ -10693,7 +10911,7 @@
                 <w:sz w:val="19"/>
                 <w:szCs w:val="19"/>
               </w:rPr>
-              <w:t xml:space="preserve">Validation and QA Framework</w:t>
+              <w:t xml:space="preserve">Validation and QA Results (XLSX)</w:t>
             </w:r>
           </w:p>
         </w:tc>
@@ -10719,7 +10937,7 @@
                 <w:sz w:val="19"/>
                 <w:szCs w:val="19"/>
               </w:rPr>
-              <w:t xml:space="preserve">Reserved</w:t>
+              <w:t xml:space="preserve">Delivered</w:t>
             </w:r>
           </w:p>
         </w:tc>
@@ -10745,7 +10963,7 @@
                 <w:sz w:val="19"/>
                 <w:szCs w:val="19"/>
               </w:rPr>
-              <w:t xml:space="preserve">The seventeen pre-publication checks expanded, with a recording template and a worked example run</w:t>
+              <w:t xml:space="preserve">Four tabs: the seventeen pre-publication checks expanded with severity, where each runs and what it protects; a per-run recording sheet; a run summary whose counts and pass rate are formulas; and a failure log that stays open until a later run re-verifies the fix</w:t>
             </w:r>
           </w:p>
         </w:tc>
@@ -11143,7 +11361,7 @@
           <w:sz w:val="22"/>
           <w:szCs w:val="22"/>
         </w:rPr>
-        <w:t xml:space="preserve">Validation results recorded in docs/ with a date, so the numbers in the reports are reproducible.</w:t>
+        <w:t xml:space="preserve">Validation results recorded in docs/22_Validation_Results.xlsx with a date, so the numbers in the reports are reproducible.</w:t>
       </w:r>
     </w:p>
     <w:p>

</xml_diff>